<commit_message>
Rewrite the Milestone 1 writeup in the first person.
</commit_message>
<xml_diff>
--- a/docs/milestone-1-data-and-questions.docx
+++ b/docs/milestone-1-data-and-questions.docx
@@ -2,7 +2,7 @@
 <file path=word/document.xml><?xml version="1.0" encoding="utf-8"?>
 <w:document xmlns:w="http://schemas.openxmlformats.org/wordprocessingml/2006/main" xmlns:m="http://schemas.openxmlformats.org/officeDocument/2006/math" xmlns:r="http://schemas.openxmlformats.org/officeDocument/2006/relationships" xmlns:o="urn:schemas-microsoft-com:office:office" xmlns:v="urn:schemas-microsoft-com:vml" xmlns:w10="urn:schemas-microsoft-com:office:word" xmlns:a="http://schemas.openxmlformats.org/drawingml/2006/main" xmlns:pic="http://schemas.openxmlformats.org/drawingml/2006/picture" xmlns:wp="http://schemas.openxmlformats.org/drawingml/2006/wordprocessingDrawing">
   <w:body>
-    <w:bookmarkStart w:id="14" w:name="X31fe416980a8c7a73e9771cdc3e855238b2305a"/>
+    <w:bookmarkStart w:id="15" w:name="X31fe416980a8c7a73e9771cdc3e855238b2305a"/>
     <w:p>
       <w:pPr>
         <w:pStyle w:val="Heading1"/>
@@ -16,58 +16,22 @@
         <w:pStyle w:val="FirstParagraph"/>
       </w:pPr>
       <w:r>
-        <w:rPr>
-          <w:b/>
-          <w:bCs/>
-        </w:rPr>
-        <w:t xml:space="preserve">Course:</w:t>
-      </w:r>
-      <w:r>
-        <w:t xml:space="preserve"> </w:t>
-      </w:r>
-      <w:r>
         <w:t xml:space="preserve">DATS 6450</w:t>
       </w:r>
       <w:r>
         <w:br/>
       </w:r>
       <w:r>
-        <w:rPr>
-          <w:b/>
-          <w:bCs/>
-        </w:rPr>
-        <w:t xml:space="preserve">Project:</w:t>
-      </w:r>
-      <w:r>
-        <w:t xml:space="preserve"> </w:t>
-      </w:r>
-      <w:r>
-        <w:t xml:space="preserve">Torque Diagnostics</w:t>
-      </w:r>
-      <w:r>
-        <w:br/>
-      </w:r>
-      <w:r>
-        <w:rPr>
-          <w:b/>
-          <w:bCs/>
-        </w:rPr>
-        <w:t xml:space="preserve">Dataset:</w:t>
-      </w:r>
-      <w:r>
-        <w:t xml:space="preserve"> </w:t>
-      </w:r>
-      <w:r>
-        <w:t xml:space="preserve">ABB technical library (English PDFs)</w:t>
-      </w:r>
-    </w:p>
-    <w:bookmarkStart w:id="9" w:name="dataset"/>
+        <w:t xml:space="preserve">Project: Torque Diagnostics</w:t>
+      </w:r>
+    </w:p>
+    <w:bookmarkStart w:id="9" w:name="what-i-am-working-on"/>
     <w:p>
       <w:pPr>
         <w:pStyle w:val="Heading2"/>
       </w:pPr>
       <w:r>
-        <w:t xml:space="preserve">Dataset</w:t>
+        <w:t xml:space="preserve">What I am working on</w:t>
       </w:r>
     </w:p>
     <w:p>
@@ -75,32 +39,25 @@
         <w:pStyle w:val="FirstParagraph"/>
       </w:pPr>
       <w:r>
-        <w:t xml:space="preserve">Torque Diagnostics answers technician questions from ABB product manuals. The source list is</w:t>
-      </w:r>
-      <w:r>
-        <w:t xml:space="preserve"> </w:t>
-      </w:r>
-      <w:r>
-        <w:rPr>
-          <w:rStyle w:val="VerbatimChar"/>
-        </w:rPr>
-        <w:t xml:space="preserve">ABB_100GB_Download_List.csv</w:t>
-      </w:r>
-      <w:r>
-        <w:t xml:space="preserve">:</w:t>
-      </w:r>
-      <w:r>
-        <w:t xml:space="preserve"> </w:t>
-      </w:r>
-      <w:r>
-        <w:rPr>
-          <w:b/>
-          <w:bCs/>
-        </w:rPr>
-        <w:t xml:space="preserve">28,666 PDFs, 101.8 GB</w:t>
-      </w:r>
-      <w:r>
-        <w:t xml:space="preserve">. Every file is a PDF. The largest groups are data sheets (10,491), manuals (6,754), instructions (4,434), information sheets (2,491), and application notes (1,146). Smaller groups include technical descriptions, brochures, catalogues, service instructions, drawings, and parts lists.</w:t>
+        <w:t xml:space="preserve">I am building a technician assistant for ABB drive manuals. The idea is that someone asks a normal question, for example what tools are needed to flange-mount an ACS880-11, or under which circumstances an ACS860 does an automatic reset, and the answer has to come from the manual page. If the retrieved pages do not actually say the step, I do not want the system to fill it in.</w:t>
+      </w:r>
+    </w:p>
+    <w:bookmarkEnd w:id="9"/>
+    <w:bookmarkStart w:id="10" w:name="the-data"/>
+    <w:p>
+      <w:pPr>
+        <w:pStyle w:val="Heading2"/>
+      </w:pPr>
+      <w:r>
+        <w:t xml:space="preserve">The data</w:t>
+      </w:r>
+    </w:p>
+    <w:p>
+      <w:pPr>
+        <w:pStyle w:val="FirstParagraph"/>
+      </w:pPr>
+      <w:r>
+        <w:t xml:space="preserve">The file list I am using is ABB_100GB_Download_List.csv. It has 28,666 PDFs, and the file sizes add up to 101.8 GB. All of them are PDFs. Most of the list is data sheets (10,491), manuals (6,754), and instructions (4,434). After that there are information sheets (2,491) and application notes (1,146), plus technical descriptions, brochures, catalogues, service instructions, drawings, and parts lists.</w:t>
       </w:r>
     </w:p>
     <w:p>
@@ -108,56 +65,7 @@
         <w:pStyle w:val="BodyText"/>
       </w:pPr>
       <w:r>
-        <w:t xml:space="preserve">Each PDF is stored in Amazon S3 by equipment family and document kind, at</w:t>
-      </w:r>
-      <w:r>
-        <w:t xml:space="preserve"> </w:t>
-      </w:r>
-      <w:r>
-        <w:rPr>
-          <w:rStyle w:val="VerbatimChar"/>
-        </w:rPr>
-        <w:t xml:space="preserve">raw/&lt;family&gt;/&lt;kind&gt;/&lt;document_id&gt;.pdf</w:t>
-      </w:r>
-      <w:r>
-        <w:t xml:space="preserve">. A title that names one series, such as ACS880-11 or ACS860, is filed under that series. Catalogues, articles, brochures, and technical files with no series in the title stay in</w:t>
-      </w:r>
-      <w:r>
-        <w:t xml:space="preserve"> </w:t>
-      </w:r>
-      <w:r>
-        <w:rPr>
-          <w:rStyle w:val="VerbatimChar"/>
-        </w:rPr>
-        <w:t xml:space="preserve">library</w:t>
-      </w:r>
-      <w:r>
-        <w:t xml:space="preserve">. The layout used for this corpus has</w:t>
-      </w:r>
-      <w:r>
-        <w:t xml:space="preserve"> </w:t>
-      </w:r>
-      <w:r>
-        <w:rPr>
-          <w:b/>
-          <w:bCs/>
-        </w:rPr>
-        <w:t xml:space="preserve">139 folders</w:t>
-      </w:r>
-      <w:r>
-        <w:t xml:space="preserve">: 138 named equipment folders plus</w:t>
-      </w:r>
-      <w:r>
-        <w:t xml:space="preserve"> </w:t>
-      </w:r>
-      <w:r>
-        <w:rPr>
-          <w:rStyle w:val="VerbatimChar"/>
-        </w:rPr>
-        <w:t xml:space="preserve">library</w:t>
-      </w:r>
-      <w:r>
-        <w:t xml:space="preserve">.</w:t>
+        <w:t xml:space="preserve">I keep each PDF in S3 under the equipment family and the document kind, like raw/ACS880-11/manual/document_id.pdf. If the title names a series, that series is the folder. ACS880-11 and ACS860 are examples. Catalogues, articles, brochures, and files that do not name a series stay in library. For this corpus that is 139 folders: 138 equipment folders and library.</w:t>
       </w:r>
     </w:p>
     <w:p>
@@ -165,140 +73,7 @@
         <w:pStyle w:val="BodyText"/>
       </w:pPr>
       <w:r>
-        <w:t xml:space="preserve">Chunking reads the text already stored in each PDF page and writes a Parquet shard per document. A passage does not cross a page. The shard columns are</w:t>
-      </w:r>
-      <w:r>
-        <w:t xml:space="preserve"> </w:t>
-      </w:r>
-      <w:r>
-        <w:rPr>
-          <w:rStyle w:val="VerbatimChar"/>
-        </w:rPr>
-        <w:t xml:space="preserve">chunk_id</w:t>
-      </w:r>
-      <w:r>
-        <w:t xml:space="preserve">,</w:t>
-      </w:r>
-      <w:r>
-        <w:t xml:space="preserve"> </w:t>
-      </w:r>
-      <w:r>
-        <w:rPr>
-          <w:rStyle w:val="VerbatimChar"/>
-        </w:rPr>
-        <w:t xml:space="preserve">document_id</w:t>
-      </w:r>
-      <w:r>
-        <w:t xml:space="preserve">,</w:t>
-      </w:r>
-      <w:r>
-        <w:t xml:space="preserve"> </w:t>
-      </w:r>
-      <w:r>
-        <w:rPr>
-          <w:rStyle w:val="VerbatimChar"/>
-        </w:rPr>
-        <w:t xml:space="preserve">asset_family</w:t>
-      </w:r>
-      <w:r>
-        <w:t xml:space="preserve">,</w:t>
-      </w:r>
-      <w:r>
-        <w:t xml:space="preserve"> </w:t>
-      </w:r>
-      <w:r>
-        <w:rPr>
-          <w:rStyle w:val="VerbatimChar"/>
-        </w:rPr>
-        <w:t xml:space="preserve">page_number</w:t>
-      </w:r>
-      <w:r>
-        <w:t xml:space="preserve">,</w:t>
-      </w:r>
-      <w:r>
-        <w:t xml:space="preserve"> </w:t>
-      </w:r>
-      <w:r>
-        <w:rPr>
-          <w:rStyle w:val="VerbatimChar"/>
-        </w:rPr>
-        <w:t xml:space="preserve">tracing_page</w:t>
-      </w:r>
-      <w:r>
-        <w:t xml:space="preserve">,</w:t>
-      </w:r>
-      <w:r>
-        <w:t xml:space="preserve"> </w:t>
-      </w:r>
-      <w:r>
-        <w:rPr>
-          <w:rStyle w:val="VerbatimChar"/>
-        </w:rPr>
-        <w:t xml:space="preserve">fault_code</w:t>
-      </w:r>
-      <w:r>
-        <w:t xml:space="preserve">,</w:t>
-      </w:r>
-      <w:r>
-        <w:t xml:space="preserve"> </w:t>
-      </w:r>
-      <w:r>
-        <w:rPr>
-          <w:rStyle w:val="VerbatimChar"/>
-        </w:rPr>
-        <w:t xml:space="preserve">part</w:t>
-      </w:r>
-      <w:r>
-        <w:t xml:space="preserve">,</w:t>
-      </w:r>
-      <w:r>
-        <w:t xml:space="preserve"> </w:t>
-      </w:r>
-      <w:r>
-        <w:rPr>
-          <w:rStyle w:val="VerbatimChar"/>
-        </w:rPr>
-        <w:t xml:space="preserve">procedure</w:t>
-      </w:r>
-      <w:r>
-        <w:t xml:space="preserve">,</w:t>
-      </w:r>
-      <w:r>
-        <w:t xml:space="preserve"> </w:t>
-      </w:r>
-      <w:r>
-        <w:rPr>
-          <w:rStyle w:val="VerbatimChar"/>
-        </w:rPr>
-        <w:t xml:space="preserve">text</w:t>
-      </w:r>
-      <w:r>
-        <w:t xml:space="preserve">, and</w:t>
-      </w:r>
-      <w:r>
-        <w:t xml:space="preserve"> </w:t>
-      </w:r>
-      <w:r>
-        <w:rPr>
-          <w:rStyle w:val="VerbatimChar"/>
-        </w:rPr>
-        <w:t xml:space="preserve">batch_id</w:t>
-      </w:r>
-      <w:r>
-        <w:t xml:space="preserve">. The finished chunk run stored</w:t>
-      </w:r>
-      <w:r>
-        <w:t xml:space="preserve"> </w:t>
-      </w:r>
-      <w:r>
-        <w:rPr>
-          <w:b/>
-          <w:bCs/>
-        </w:rPr>
-        <w:t xml:space="preserve">28,665 shards and 831,185 passages</w:t>
-      </w:r>
-      <w:r>
-        <w:t xml:space="preserve">, with no blank passages. Later token, BM25, and embedding indexes are built from those passages, one file per family. The reply step reads the search index. It does not read the raw PDFs at question time.</w:t>
+        <w:t xml:space="preserve">I already chunked the pages into Parquet. A passage stays on one page. Each row has the chunk id, document id, family, page number, whether the page is a tracing page, any fault code, part, procedure name, the text, and the batch id. The chunk run finished with 28,665 shards and 831,185 passages, and none of those passages were blank. The token files, the BM25 index, and the embedding index are built from those passages, one file per family. When I ask a question, the reply reads the search index. It does not open the PDF again.</w:t>
       </w:r>
     </w:p>
     <w:p>
@@ -306,17 +81,17 @@
         <w:pStyle w:val="BodyText"/>
       </w:pPr>
       <w:r>
-        <w:t xml:space="preserve">This is a multi-GB document collection. The passage table itself is under a million rows, so the scale problem is the PDF lake, the per-family indexes, and the models that read those pages, rather than a table of several hundred million transactional rows.</w:t>
-      </w:r>
-    </w:p>
-    <w:bookmarkEnd w:id="9"/>
-    <w:bookmarkStart w:id="10" w:name="high-level-problem"/>
+        <w:t xml:space="preserve">This is about 100 GB of manuals. The passage table is under a million rows, so it is not the same kind of data as a few hundred million taxi trips. What is large here is the PDF collection, the separate index for each family, and the models that have to read the pages.</w:t>
+      </w:r>
+    </w:p>
+    <w:bookmarkEnd w:id="10"/>
+    <w:bookmarkStart w:id="11" w:name="the-problem-i-want-to-answer"/>
     <w:p>
       <w:pPr>
         <w:pStyle w:val="Heading2"/>
       </w:pPr>
       <w:r>
-        <w:t xml:space="preserve">High-level problem</w:t>
+        <w:t xml:space="preserve">The problem I want to answer</w:t>
       </w:r>
     </w:p>
     <w:p>
@@ -324,11 +99,7 @@
         <w:pStyle w:val="FirstParagraph"/>
       </w:pPr>
       <w:r>
-        <w:rPr>
-          <w:b/>
-          <w:bCs/>
-        </w:rPr>
-        <w:t xml:space="preserve">How can a technician get a procedure from the ABB manuals that the indexed page actually states, for the drive family named in the question?</w:t>
+        <w:t xml:space="preserve">How can a technician get a procedure from the ABB manuals that the indexed page actually states, for the drive named in the question?</w:t>
       </w:r>
     </w:p>
     <w:p>
@@ -336,11 +107,11 @@
         <w:pStyle w:val="BodyText"/>
       </w:pPr>
       <w:r>
-        <w:t xml:space="preserve">A useful assistant has to find the right family, return the page that contains the tools, fault behavior, or parameter, and withhold a step that those pages do not support. The questions below split that problem into exploratory description of the corpus, language tasks on the pages, and measured prediction of retrieval and support.</w:t>
-      </w:r>
-    </w:p>
-    <w:bookmarkEnd w:id="10"/>
-    <w:bookmarkStart w:id="11" w:name="eda"/>
+        <w:t xml:space="preserve">I have to get the family right, find the page that has the tools or the fault behavior or the parameter, and stop if the pages I retrieved do not support the step. The questions below are how I want to split that up.</w:t>
+      </w:r>
+    </w:p>
+    <w:bookmarkEnd w:id="11"/>
+    <w:bookmarkStart w:id="12" w:name="eda"/>
     <w:p>
       <w:pPr>
         <w:pStyle w:val="Heading2"/>
@@ -358,7 +129,7 @@
         </w:numPr>
       </w:pPr>
       <w:r>
-        <w:t xml:space="preserve">How are the 28,666 PDFs distributed across equipment families and document kinds, and which families account for most of the pages?</w:t>
+        <w:t xml:space="preserve">How are the 28,666 PDFs spread across equipment families and document kinds, and which families have most of the pages?</w:t>
       </w:r>
     </w:p>
     <w:p>
@@ -370,7 +141,7 @@
         </w:numPr>
       </w:pPr>
       <w:r>
-        <w:t xml:space="preserve">How do passage length and pages per document vary by family and document kind?</w:t>
+        <w:t xml:space="preserve">How does passage length, and the number of pages in a document, change by family and by document kind?</w:t>
       </w:r>
     </w:p>
     <w:p>
@@ -382,7 +153,7 @@
         </w:numPr>
       </w:pPr>
       <w:r>
-        <w:t xml:space="preserve">Which families contain fault codes, part numbers, and named procedures, and which families are mostly data sheets or catalogue text?</w:t>
+        <w:t xml:space="preserve">Which families actually contain fault codes, part numbers, and named procedures, and which ones are mostly data sheets or catalogue text?</w:t>
       </w:r>
     </w:p>
     <w:p>
@@ -394,19 +165,7 @@
         </w:numPr>
       </w:pPr>
       <w:r>
-        <w:t xml:space="preserve">What share of pages are tracing or wiring pages, and does that share differ for drive families such as ACS880 and ACS860 versus</w:t>
-      </w:r>
-      <w:r>
-        <w:t xml:space="preserve"> </w:t>
-      </w:r>
-      <w:r>
-        <w:rPr>
-          <w:rStyle w:val="VerbatimChar"/>
-        </w:rPr>
-        <w:t xml:space="preserve">library</w:t>
-      </w:r>
-      <w:r>
-        <w:t xml:space="preserve">?</w:t>
+        <w:t xml:space="preserve">What share of pages are tracing or wiring pages, and is that different for drive families like ACS880 and ACS860 than it is for library?</w:t>
       </w:r>
     </w:p>
     <w:p>
@@ -418,11 +177,11 @@
         </w:numPr>
       </w:pPr>
       <w:r>
-        <w:t xml:space="preserve">Do the same document ids or procedure names appear in more than one family, and where does that overlap change which folder a question should read?</w:t>
-      </w:r>
-    </w:p>
-    <w:bookmarkEnd w:id="11"/>
-    <w:bookmarkStart w:id="12" w:name="nlp"/>
+        <w:t xml:space="preserve">Do the same document ids or procedure names show up in more than one family, and does that change which folder a question should read?</w:t>
+      </w:r>
+    </w:p>
+    <w:bookmarkEnd w:id="12"/>
+    <w:bookmarkStart w:id="13" w:name="nlp"/>
     <w:p>
       <w:pPr>
         <w:pStyle w:val="Heading2"/>
@@ -440,7 +199,7 @@
         </w:numPr>
       </w:pPr>
       <w:r>
-        <w:t xml:space="preserve">For a technician question that names a tool list, a fault reset, or a parameter, which pages does keyword search return, which pages does the embedding search return, and which pages does the merged ranking return?</w:t>
+        <w:t xml:space="preserve">If I ask about a tool list, a fault reset, or a parameter, which pages does keyword search return, which pages does the embedding search return, and which pages does the combined ranking return?</w:t>
       </w:r>
     </w:p>
     <w:p>
@@ -452,7 +211,7 @@
         </w:numPr>
       </w:pPr>
       <w:r>
-        <w:t xml:space="preserve">What procedure and fault language is shared across drive families, and what wording is specific to one family?</w:t>
+        <w:t xml:space="preserve">What procedure and fault wording shows up across drive families, and what wording belongs to only one family?</w:t>
       </w:r>
     </w:p>
     <w:p>
@@ -464,7 +223,7 @@
         </w:numPr>
       </w:pPr>
       <w:r>
-        <w:t xml:space="preserve">When a draft copies a sentence from a retrieved page, which page should be cited, and when should a sentence be dropped because no retrieved page states it?</w:t>
+        <w:t xml:space="preserve">When the draft copies a sentence from a retrieved page, which page should be cited, and when should a sentence be dropped because none of the retrieved pages say it?</w:t>
       </w:r>
     </w:p>
     <w:p>
@@ -476,11 +235,11 @@
         </w:numPr>
       </w:pPr>
       <w:r>
-        <w:t xml:space="preserve">Which questions cannot be answered from the retrieved pages, and is the gap a missing manual, the wrong family, or a page that was retrieved but does not contain the procedure?</w:t>
-      </w:r>
-    </w:p>
-    <w:bookmarkEnd w:id="12"/>
-    <w:bookmarkStart w:id="13" w:name="stats-and-ml"/>
+        <w:t xml:space="preserve">Which questions come back with no supported answer, and is that because the manual is missing, the family was wrong, or the page was retrieved but does not contain the procedure?</w:t>
+      </w:r>
+    </w:p>
+    <w:bookmarkEnd w:id="13"/>
+    <w:bookmarkStart w:id="14" w:name="stats-and-ml"/>
     <w:p>
       <w:pPr>
         <w:pStyle w:val="Heading2"/>
@@ -498,7 +257,7 @@
         </w:numPr>
       </w:pPr>
       <w:r>
-        <w:t xml:space="preserve">Can a passage be classified as a procedure, a fault description, a parameter table, or ordinary prose from its text and the identifier fields already stored on the row?</w:t>
+        <w:t xml:space="preserve">Can I tell from the text, and from the fault code, part, and procedure fields, whether a passage is a procedure, a fault description, a parameter table, or just ordinary text?</w:t>
       </w:r>
     </w:p>
     <w:p>
@@ -510,7 +269,7 @@
         </w:numPr>
       </w:pPr>
       <w:r>
-        <w:t xml:space="preserve">Given a question and a retrieved page, can a model decide whether that page supports the answer or whether the answer should be withheld?</w:t>
+        <w:t xml:space="preserve">Given a question and a retrieved page, can a model tell whether that page supports the answer, or whether the answer should be held back?</w:t>
       </w:r>
     </w:p>
     <w:p>
@@ -522,11 +281,11 @@
         </w:numPr>
       </w:pPr>
       <w:r>
-        <w:t xml:space="preserve">On a labeled set of technician questions, what precision, recall, F1, and mean reciprocal rank does the merged retrieval achieve, and how do those scores change between keyword search and embedding search alone?</w:t>
-      </w:r>
-    </w:p>
-    <w:bookmarkEnd w:id="13"/>
+        <w:t xml:space="preserve">On a labeled set of technician questions, what precision, recall, F1, and mean reciprocal rank does the combined search get, and how does that compare with keyword search alone and embedding search alone?</w:t>
+      </w:r>
+    </w:p>
     <w:bookmarkEnd w:id="14"/>
+    <w:bookmarkEnd w:id="15"/>
     <w:sectPr>
       <w:footnotePr>
         <w:numRestart w:val="eachSect"/>

</xml_diff>